<commit_message>
started work on presentation
</commit_message>
<xml_diff>
--- a/course_project/docu.docx
+++ b/course_project/docu.docx
@@ -1,6 +1,6 @@
 
 <file path=word/document.xml><?xml version="1.0" encoding="utf-8"?>
-<w:document xmlns:wpc="http://schemas.microsoft.com/office/word/2010/wordprocessingCanvas" xmlns:cx="http://schemas.microsoft.com/office/drawing/2014/chartex" xmlns:cx1="http://schemas.microsoft.com/office/drawing/2015/9/8/chartex" xmlns:cx2="http://schemas.microsoft.com/office/drawing/2015/10/21/chartex" xmlns:cx3="http://schemas.microsoft.com/office/drawing/2016/5/9/chartex" xmlns:cx4="http://schemas.microsoft.com/office/drawing/2016/5/10/chartex" xmlns:cx5="http://schemas.microsoft.com/office/drawing/2016/5/11/chartex" xmlns:cx6="http://schemas.microsoft.com/office/drawing/2016/5/12/chartex" xmlns:cx7="http://schemas.microsoft.com/office/drawing/2016/5/13/chartex" xmlns:cx8="http://schemas.microsoft.com/office/drawing/2016/5/14/chartex" xmlns:mc="http://schemas.openxmlformats.org/markup-compatibility/2006" xmlns:aink="http://schemas.microsoft.com/office/drawing/2016/ink" xmlns:am3d="http://schemas.microsoft.com/office/drawing/2017/model3d" xmlns:o="urn:schemas-microsoft-com:office:office" xmlns:oel="http://schemas.microsoft.com/office/2019/extlst" xmlns:r="http://schemas.openxmlformats.org/officeDocument/2006/relationships" xmlns:m="http://schemas.openxmlformats.org/officeDocument/2006/math" xmlns:v="urn:schemas-microsoft-com:vml" xmlns:wp14="http://schemas.microsoft.com/office/word/2010/wordprocessingDrawing" xmlns:wp="http://schemas.openxmlformats.org/drawingml/2006/wordprocessingDrawing" xmlns:w10="urn:schemas-microsoft-com:office:word" xmlns:w="http://schemas.openxmlformats.org/wordprocessingml/2006/main" xmlns:w14="http://schemas.microsoft.com/office/word/2010/wordml" xmlns:w15="http://schemas.microsoft.com/office/word/2012/wordml" xmlns:w16cex="http://schemas.microsoft.com/office/word/2018/wordml/cex" xmlns:w16cid="http://schemas.microsoft.com/office/word/2016/wordml/cid" xmlns:w16="http://schemas.microsoft.com/office/word/2018/wordml" xmlns:w16sdtdh="http://schemas.microsoft.com/office/word/2020/wordml/sdtdatahash" xmlns:w16se="http://schemas.microsoft.com/office/word/2015/wordml/symex" xmlns:wpg="http://schemas.microsoft.com/office/word/2010/wordprocessingGroup" xmlns:wpi="http://schemas.microsoft.com/office/word/2010/wordprocessingInk" xmlns:wne="http://schemas.microsoft.com/office/word/2006/wordml" xmlns:wps="http://schemas.microsoft.com/office/word/2010/wordprocessingShape" mc:Ignorable="w14 w15 w16se w16cid w16 w16cex w16sdtdh wp14">
+<w:document xmlns:wpc="http://schemas.microsoft.com/office/word/2010/wordprocessingCanvas" xmlns:cx="http://schemas.microsoft.com/office/drawing/2014/chartex" xmlns:cx1="http://schemas.microsoft.com/office/drawing/2015/9/8/chartex" xmlns:cx2="http://schemas.microsoft.com/office/drawing/2015/10/21/chartex" xmlns:cx3="http://schemas.microsoft.com/office/drawing/2016/5/9/chartex" xmlns:cx4="http://schemas.microsoft.com/office/drawing/2016/5/10/chartex" xmlns:cx5="http://schemas.microsoft.com/office/drawing/2016/5/11/chartex" xmlns:cx6="http://schemas.microsoft.com/office/drawing/2016/5/12/chartex" xmlns:cx7="http://schemas.microsoft.com/office/drawing/2016/5/13/chartex" xmlns:cx8="http://schemas.microsoft.com/office/drawing/2016/5/14/chartex" xmlns:mc="http://schemas.openxmlformats.org/markup-compatibility/2006" xmlns:aink="http://schemas.microsoft.com/office/drawing/2016/ink" xmlns:am3d="http://schemas.microsoft.com/office/drawing/2017/model3d" xmlns:o="urn:schemas-microsoft-com:office:office" xmlns:oel="http://schemas.microsoft.com/office/2019/extlst" xmlns:r="http://schemas.openxmlformats.org/officeDocument/2006/relationships" xmlns:m="http://schemas.openxmlformats.org/officeDocument/2006/math" xmlns:v="urn:schemas-microsoft-com:vml" xmlns:wp14="http://schemas.microsoft.com/office/word/2010/wordprocessingDrawing" xmlns:wp="http://schemas.openxmlformats.org/drawingml/2006/wordprocessingDrawing" xmlns:w10="urn:schemas-microsoft-com:office:word" xmlns:w="http://schemas.openxmlformats.org/wordprocessingml/2006/main" xmlns:w14="http://schemas.microsoft.com/office/word/2010/wordml" xmlns:w15="http://schemas.microsoft.com/office/word/2012/wordml" xmlns:w16cex="http://schemas.microsoft.com/office/word/2018/wordml/cex" xmlns:w16cid="http://schemas.microsoft.com/office/word/2016/wordml/cid" xmlns:w16="http://schemas.microsoft.com/office/word/2018/wordml" xmlns:w16du="http://schemas.microsoft.com/office/word/2023/wordml/word16du" xmlns:w16sdtdh="http://schemas.microsoft.com/office/word/2020/wordml/sdtdatahash" xmlns:w16sdtfl="http://schemas.microsoft.com/office/word/2024/wordml/sdtformatlock" xmlns:w16se="http://schemas.microsoft.com/office/word/2015/wordml/symex" xmlns:wpg="http://schemas.microsoft.com/office/word/2010/wordprocessingGroup" xmlns:wpi="http://schemas.microsoft.com/office/word/2010/wordprocessingInk" xmlns:wne="http://schemas.microsoft.com/office/word/2006/wordml" xmlns:wps="http://schemas.microsoft.com/office/word/2010/wordprocessingShape" mc:Ignorable="w14 w15 w16se w16cid w16 w16cex w16sdtdh w16sdtfl w16du wp14">
   <w:body>
     <w:p>
       <w:pPr>
@@ -986,9 +986,12 @@
           <w:r>
             <w:rPr>
               <w:rStyle w:val="afc"/>
-              <w:rFonts w:ascii="Times New Roman" w:eastAsia="Times New Roman" w:hAnsi="Times New Roman" w:cs="Times New Roman"/>
+              <w:rFonts w:ascii="Times New Roman" w:hAnsi="Times New Roman" w:cs="Times New Roman"/>
+              <w:b/>
+              <w:bCs/>
               <w:color w:val="auto"/>
-              <w:lang w:eastAsia="ru-RU"/>
+              <w:sz w:val="28"/>
+              <w:szCs w:val="28"/>
             </w:rPr>
             <w:commentReference w:id="1"/>
           </w:r>
@@ -2374,7 +2377,8 @@
       <w:r>
         <w:rPr>
           <w:rStyle w:val="afc"/>
-          <w:rFonts w:eastAsia="Times New Roman"/>
+          <w:sz w:val="28"/>
+          <w:szCs w:val="28"/>
         </w:rPr>
         <w:commentReference w:id="6"/>
       </w:r>
@@ -2670,7 +2674,8 @@
       <w:r>
         <w:rPr>
           <w:rStyle w:val="afc"/>
-          <w:rFonts w:eastAsia="Times New Roman"/>
+          <w:sz w:val="28"/>
+          <w:szCs w:val="28"/>
         </w:rPr>
         <w:commentReference w:id="7"/>
       </w:r>
@@ -2734,7 +2739,8 @@
       <w:r>
         <w:rPr>
           <w:rStyle w:val="afc"/>
-          <w:rFonts w:eastAsia="Times New Roman"/>
+          <w:sz w:val="28"/>
+          <w:szCs w:val="28"/>
         </w:rPr>
         <w:commentReference w:id="9"/>
       </w:r>
@@ -2851,6 +2857,10 @@
       <w:r>
         <w:rPr>
           <w:rStyle w:val="afc"/>
+          <w:color w:val="0F1115"/>
+          <w:sz w:val="28"/>
+          <w:szCs w:val="28"/>
+          <w:shd w:val="clear" w:color="auto" w:fill="FFFFFF"/>
         </w:rPr>
         <w:commentReference w:id="10"/>
       </w:r>
@@ -3040,7 +3050,8 @@
       <w:r>
         <w:rPr>
           <w:rStyle w:val="afc"/>
-          <w:rFonts w:eastAsia="Times New Roman"/>
+          <w:sz w:val="28"/>
+          <w:szCs w:val="28"/>
         </w:rPr>
         <w:commentReference w:id="11"/>
       </w:r>
@@ -3079,7 +3090,8 @@
       <w:r>
         <w:rPr>
           <w:rStyle w:val="afc"/>
-          <w:rFonts w:eastAsia="Times New Roman"/>
+          <w:sz w:val="28"/>
+          <w:szCs w:val="28"/>
         </w:rPr>
         <w:commentReference w:id="13"/>
       </w:r>
@@ -3211,6 +3223,10 @@
       <w:r>
         <w:rPr>
           <w:rStyle w:val="afc"/>
+          <w:color w:val="0F1115"/>
+          <w:sz w:val="28"/>
+          <w:szCs w:val="28"/>
+          <w:shd w:val="clear" w:color="auto" w:fill="FFFFFF"/>
         </w:rPr>
         <w:commentReference w:id="14"/>
       </w:r>
@@ -3387,7 +3403,8 @@
       <w:r>
         <w:rPr>
           <w:rStyle w:val="afc"/>
-          <w:rFonts w:eastAsia="Times New Roman"/>
+          <w:sz w:val="28"/>
+          <w:szCs w:val="28"/>
         </w:rPr>
         <w:commentReference w:id="15"/>
       </w:r>
@@ -3666,8 +3683,8 @@
       <w:r>
         <w:rPr>
           <w:rStyle w:val="afc"/>
-          <w:rFonts w:eastAsia="Times New Roman"/>
-          <w:b w:val="0"/>
+          <w:sz w:val="28"/>
+          <w:szCs w:val="32"/>
         </w:rPr>
         <w:commentReference w:id="18"/>
       </w:r>
@@ -3861,7 +3878,8 @@
       <w:r>
         <w:rPr>
           <w:rStyle w:val="afc"/>
-          <w:rFonts w:eastAsia="Times New Roman"/>
+          <w:sz w:val="28"/>
+          <w:szCs w:val="28"/>
         </w:rPr>
         <w:commentReference w:id="21"/>
       </w:r>
@@ -4022,7 +4040,8 @@
       <w:r>
         <w:rPr>
           <w:rStyle w:val="afc"/>
-          <w:rFonts w:eastAsia="Times New Roman"/>
+          <w:sz w:val="28"/>
+          <w:szCs w:val="28"/>
         </w:rPr>
         <w:commentReference w:id="23"/>
       </w:r>
@@ -4358,7 +4377,8 @@
             <w:r>
               <w:rPr>
                 <w:rStyle w:val="afc"/>
-                <w:rFonts w:eastAsia="Times New Roman"/>
+                <w:sz w:val="28"/>
+                <w:szCs w:val="28"/>
               </w:rPr>
               <w:commentReference w:id="26"/>
             </w:r>
@@ -4555,7 +4575,8 @@
             <w:r>
               <w:rPr>
                 <w:rStyle w:val="afc"/>
-                <w:rFonts w:eastAsia="Times New Roman"/>
+                <w:sz w:val="28"/>
+                <w:szCs w:val="28"/>
               </w:rPr>
               <w:commentReference w:id="27"/>
             </w:r>
@@ -10556,23 +10577,7 @@
         <w:pStyle w:val="a1"/>
       </w:pPr>
       <w:r>
-        <w:t>Разработка процедур базы данных</w:t>
-      </w:r>
-    </w:p>
-    <w:p>
-      <w:pPr>
-        <w:pStyle w:val="a1"/>
-      </w:pPr>
-      <w:r>
         <w:t>Разработка функций базы данных</w:t>
-      </w:r>
-    </w:p>
-    <w:p>
-      <w:pPr>
-        <w:pStyle w:val="a1"/>
-      </w:pPr>
-      <w:r>
-        <w:t>Разработка представлений базы данных</w:t>
       </w:r>
     </w:p>
     <w:p>
@@ -10733,7 +10738,6 @@
         <w:ind w:left="709"/>
       </w:pPr>
       <w:r>
-        <w:lastRenderedPageBreak/>
         <w:t xml:space="preserve">Список используемых источников </w:t>
       </w:r>
     </w:p>
@@ -10760,6 +10764,7 @@
         <w:ind w:left="709"/>
       </w:pPr>
       <w:r>
+        <w:lastRenderedPageBreak/>
         <w:t>Приложение Б</w:t>
       </w:r>
     </w:p>
@@ -10782,7 +10787,7 @@
 </file>
 
 <file path=word/comments.xml><?xml version="1.0" encoding="utf-8"?>
-<w:comments xmlns:wpc="http://schemas.microsoft.com/office/word/2010/wordprocessingCanvas" xmlns:cx="http://schemas.microsoft.com/office/drawing/2014/chartex" xmlns:cx1="http://schemas.microsoft.com/office/drawing/2015/9/8/chartex" xmlns:cx2="http://schemas.microsoft.com/office/drawing/2015/10/21/chartex" xmlns:cx3="http://schemas.microsoft.com/office/drawing/2016/5/9/chartex" xmlns:cx4="http://schemas.microsoft.com/office/drawing/2016/5/10/chartex" xmlns:cx5="http://schemas.microsoft.com/office/drawing/2016/5/11/chartex" xmlns:cx6="http://schemas.microsoft.com/office/drawing/2016/5/12/chartex" xmlns:cx7="http://schemas.microsoft.com/office/drawing/2016/5/13/chartex" xmlns:cx8="http://schemas.microsoft.com/office/drawing/2016/5/14/chartex" xmlns:mc="http://schemas.openxmlformats.org/markup-compatibility/2006" xmlns:aink="http://schemas.microsoft.com/office/drawing/2016/ink" xmlns:am3d="http://schemas.microsoft.com/office/drawing/2017/model3d" xmlns:o="urn:schemas-microsoft-com:office:office" xmlns:oel="http://schemas.microsoft.com/office/2019/extlst" xmlns:r="http://schemas.openxmlformats.org/officeDocument/2006/relationships" xmlns:m="http://schemas.openxmlformats.org/officeDocument/2006/math" xmlns:v="urn:schemas-microsoft-com:vml" xmlns:wp14="http://schemas.microsoft.com/office/word/2010/wordprocessingDrawing" xmlns:wp="http://schemas.openxmlformats.org/drawingml/2006/wordprocessingDrawing" xmlns:w10="urn:schemas-microsoft-com:office:word" xmlns:w="http://schemas.openxmlformats.org/wordprocessingml/2006/main" xmlns:w14="http://schemas.microsoft.com/office/word/2010/wordml" xmlns:w15="http://schemas.microsoft.com/office/word/2012/wordml" xmlns:w16cex="http://schemas.microsoft.com/office/word/2018/wordml/cex" xmlns:w16cid="http://schemas.microsoft.com/office/word/2016/wordml/cid" xmlns:w16="http://schemas.microsoft.com/office/word/2018/wordml" xmlns:w16sdtdh="http://schemas.microsoft.com/office/word/2020/wordml/sdtdatahash" xmlns:w16se="http://schemas.microsoft.com/office/word/2015/wordml/symex" xmlns:wpg="http://schemas.microsoft.com/office/word/2010/wordprocessingGroup" xmlns:wpi="http://schemas.microsoft.com/office/word/2010/wordprocessingInk" xmlns:wne="http://schemas.microsoft.com/office/word/2006/wordml" xmlns:wps="http://schemas.microsoft.com/office/word/2010/wordprocessingShape" mc:Ignorable="w14 w15 w16se w16cid w16 w16cex w16sdtdh wp14">
+<w:comments xmlns:wpc="http://schemas.microsoft.com/office/word/2010/wordprocessingCanvas" xmlns:cx="http://schemas.microsoft.com/office/drawing/2014/chartex" xmlns:cx1="http://schemas.microsoft.com/office/drawing/2015/9/8/chartex" xmlns:cx2="http://schemas.microsoft.com/office/drawing/2015/10/21/chartex" xmlns:cx3="http://schemas.microsoft.com/office/drawing/2016/5/9/chartex" xmlns:cx4="http://schemas.microsoft.com/office/drawing/2016/5/10/chartex" xmlns:cx5="http://schemas.microsoft.com/office/drawing/2016/5/11/chartex" xmlns:cx6="http://schemas.microsoft.com/office/drawing/2016/5/12/chartex" xmlns:cx7="http://schemas.microsoft.com/office/drawing/2016/5/13/chartex" xmlns:cx8="http://schemas.microsoft.com/office/drawing/2016/5/14/chartex" xmlns:mc="http://schemas.openxmlformats.org/markup-compatibility/2006" xmlns:aink="http://schemas.microsoft.com/office/drawing/2016/ink" xmlns:am3d="http://schemas.microsoft.com/office/drawing/2017/model3d" xmlns:o="urn:schemas-microsoft-com:office:office" xmlns:oel="http://schemas.microsoft.com/office/2019/extlst" xmlns:r="http://schemas.openxmlformats.org/officeDocument/2006/relationships" xmlns:m="http://schemas.openxmlformats.org/officeDocument/2006/math" xmlns:v="urn:schemas-microsoft-com:vml" xmlns:wp14="http://schemas.microsoft.com/office/word/2010/wordprocessingDrawing" xmlns:wp="http://schemas.openxmlformats.org/drawingml/2006/wordprocessingDrawing" xmlns:w10="urn:schemas-microsoft-com:office:word" xmlns:w="http://schemas.openxmlformats.org/wordprocessingml/2006/main" xmlns:w14="http://schemas.microsoft.com/office/word/2010/wordml" xmlns:w15="http://schemas.microsoft.com/office/word/2012/wordml" xmlns:w16cex="http://schemas.microsoft.com/office/word/2018/wordml/cex" xmlns:w16cid="http://schemas.microsoft.com/office/word/2016/wordml/cid" xmlns:w16="http://schemas.microsoft.com/office/word/2018/wordml" xmlns:w16du="http://schemas.microsoft.com/office/word/2023/wordml/word16du" xmlns:w16sdtdh="http://schemas.microsoft.com/office/word/2020/wordml/sdtdatahash" xmlns:w16sdtfl="http://schemas.microsoft.com/office/word/2024/wordml/sdtformatlock" xmlns:w16se="http://schemas.microsoft.com/office/word/2015/wordml/symex" xmlns:wpg="http://schemas.microsoft.com/office/word/2010/wordprocessingGroup" xmlns:wpi="http://schemas.microsoft.com/office/word/2010/wordprocessingInk" xmlns:wne="http://schemas.microsoft.com/office/word/2006/wordml" xmlns:wps="http://schemas.microsoft.com/office/word/2010/wordprocessingShape" mc:Ignorable="w14 w15 w16se w16cid w16 w16cex w16sdtdh w16sdtfl w16du wp14">
   <w:comment w:id="1" w:author="Пользователь Windows" w:date="2026-04-01T13:57:00Z" w:initials="ПW">
     <w:p>
       <w:pPr>
@@ -11094,7 +11099,7 @@
 </file>
 
 <file path=word/commentsExtended.xml><?xml version="1.0" encoding="utf-8"?>
-<w15:commentsEx xmlns:wpc="http://schemas.microsoft.com/office/word/2010/wordprocessingCanvas" xmlns:cx="http://schemas.microsoft.com/office/drawing/2014/chartex" xmlns:cx1="http://schemas.microsoft.com/office/drawing/2015/9/8/chartex" xmlns:cx2="http://schemas.microsoft.com/office/drawing/2015/10/21/chartex" xmlns:cx3="http://schemas.microsoft.com/office/drawing/2016/5/9/chartex" xmlns:cx4="http://schemas.microsoft.com/office/drawing/2016/5/10/chartex" xmlns:cx5="http://schemas.microsoft.com/office/drawing/2016/5/11/chartex" xmlns:cx6="http://schemas.microsoft.com/office/drawing/2016/5/12/chartex" xmlns:cx7="http://schemas.microsoft.com/office/drawing/2016/5/13/chartex" xmlns:cx8="http://schemas.microsoft.com/office/drawing/2016/5/14/chartex" xmlns:mc="http://schemas.openxmlformats.org/markup-compatibility/2006" xmlns:aink="http://schemas.microsoft.com/office/drawing/2016/ink" xmlns:am3d="http://schemas.microsoft.com/office/drawing/2017/model3d" xmlns:o="urn:schemas-microsoft-com:office:office" xmlns:oel="http://schemas.microsoft.com/office/2019/extlst" xmlns:r="http://schemas.openxmlformats.org/officeDocument/2006/relationships" xmlns:m="http://schemas.openxmlformats.org/officeDocument/2006/math" xmlns:v="urn:schemas-microsoft-com:vml" xmlns:wp14="http://schemas.microsoft.com/office/word/2010/wordprocessingDrawing" xmlns:wp="http://schemas.openxmlformats.org/drawingml/2006/wordprocessingDrawing" xmlns:w10="urn:schemas-microsoft-com:office:word" xmlns:w="http://schemas.openxmlformats.org/wordprocessingml/2006/main" xmlns:w14="http://schemas.microsoft.com/office/word/2010/wordml" xmlns:w15="http://schemas.microsoft.com/office/word/2012/wordml" xmlns:w16cex="http://schemas.microsoft.com/office/word/2018/wordml/cex" xmlns:w16cid="http://schemas.microsoft.com/office/word/2016/wordml/cid" xmlns:w16="http://schemas.microsoft.com/office/word/2018/wordml" xmlns:w16sdtdh="http://schemas.microsoft.com/office/word/2020/wordml/sdtdatahash" xmlns:w16se="http://schemas.microsoft.com/office/word/2015/wordml/symex" xmlns:wpg="http://schemas.microsoft.com/office/word/2010/wordprocessingGroup" xmlns:wpi="http://schemas.microsoft.com/office/word/2010/wordprocessingInk" xmlns:wne="http://schemas.microsoft.com/office/word/2006/wordml" xmlns:wps="http://schemas.microsoft.com/office/word/2010/wordprocessingShape" mc:Ignorable="w14 w15 w16se w16cid w16 w16cex w16sdtdh wp14">
+<w15:commentsEx xmlns:wpc="http://schemas.microsoft.com/office/word/2010/wordprocessingCanvas" xmlns:cx="http://schemas.microsoft.com/office/drawing/2014/chartex" xmlns:cx1="http://schemas.microsoft.com/office/drawing/2015/9/8/chartex" xmlns:cx2="http://schemas.microsoft.com/office/drawing/2015/10/21/chartex" xmlns:cx3="http://schemas.microsoft.com/office/drawing/2016/5/9/chartex" xmlns:cx4="http://schemas.microsoft.com/office/drawing/2016/5/10/chartex" xmlns:cx5="http://schemas.microsoft.com/office/drawing/2016/5/11/chartex" xmlns:cx6="http://schemas.microsoft.com/office/drawing/2016/5/12/chartex" xmlns:cx7="http://schemas.microsoft.com/office/drawing/2016/5/13/chartex" xmlns:cx8="http://schemas.microsoft.com/office/drawing/2016/5/14/chartex" xmlns:mc="http://schemas.openxmlformats.org/markup-compatibility/2006" xmlns:aink="http://schemas.microsoft.com/office/drawing/2016/ink" xmlns:am3d="http://schemas.microsoft.com/office/drawing/2017/model3d" xmlns:o="urn:schemas-microsoft-com:office:office" xmlns:oel="http://schemas.microsoft.com/office/2019/extlst" xmlns:r="http://schemas.openxmlformats.org/officeDocument/2006/relationships" xmlns:m="http://schemas.openxmlformats.org/officeDocument/2006/math" xmlns:v="urn:schemas-microsoft-com:vml" xmlns:wp14="http://schemas.microsoft.com/office/word/2010/wordprocessingDrawing" xmlns:wp="http://schemas.openxmlformats.org/drawingml/2006/wordprocessingDrawing" xmlns:w10="urn:schemas-microsoft-com:office:word" xmlns:w="http://schemas.openxmlformats.org/wordprocessingml/2006/main" xmlns:w14="http://schemas.microsoft.com/office/word/2010/wordml" xmlns:w15="http://schemas.microsoft.com/office/word/2012/wordml" xmlns:w16cex="http://schemas.microsoft.com/office/word/2018/wordml/cex" xmlns:w16cid="http://schemas.microsoft.com/office/word/2016/wordml/cid" xmlns:w16="http://schemas.microsoft.com/office/word/2018/wordml" xmlns:w16du="http://schemas.microsoft.com/office/word/2023/wordml/word16du" xmlns:w16sdtdh="http://schemas.microsoft.com/office/word/2020/wordml/sdtdatahash" xmlns:w16sdtfl="http://schemas.microsoft.com/office/word/2024/wordml/sdtformatlock" xmlns:w16se="http://schemas.microsoft.com/office/word/2015/wordml/symex" xmlns:wpg="http://schemas.microsoft.com/office/word/2010/wordprocessingGroup" xmlns:wpi="http://schemas.microsoft.com/office/word/2010/wordprocessingInk" xmlns:wne="http://schemas.microsoft.com/office/word/2006/wordml" xmlns:wps="http://schemas.microsoft.com/office/word/2010/wordprocessingShape" mc:Ignorable="w14 w15 w16se w16cid w16 w16cex w16sdtdh w16sdtfl w16du wp14">
   <w15:commentEx w15:paraId="644CF8CC" w15:done="0"/>
   <w15:commentEx w15:paraId="0B8DE079" w15:done="0"/>
   <w15:commentEx w15:paraId="1B3851F4" w15:done="0"/>
@@ -11113,7 +11118,7 @@
 </file>
 
 <file path=word/commentsIds.xml><?xml version="1.0" encoding="utf-8"?>
-<w16cid:commentsIds xmlns:wpc="http://schemas.microsoft.com/office/word/2010/wordprocessingCanvas" xmlns:cx="http://schemas.microsoft.com/office/drawing/2014/chartex" xmlns:cx1="http://schemas.microsoft.com/office/drawing/2015/9/8/chartex" xmlns:cx2="http://schemas.microsoft.com/office/drawing/2015/10/21/chartex" xmlns:cx3="http://schemas.microsoft.com/office/drawing/2016/5/9/chartex" xmlns:cx4="http://schemas.microsoft.com/office/drawing/2016/5/10/chartex" xmlns:cx5="http://schemas.microsoft.com/office/drawing/2016/5/11/chartex" xmlns:cx6="http://schemas.microsoft.com/office/drawing/2016/5/12/chartex" xmlns:cx7="http://schemas.microsoft.com/office/drawing/2016/5/13/chartex" xmlns:cx8="http://schemas.microsoft.com/office/drawing/2016/5/14/chartex" xmlns:mc="http://schemas.openxmlformats.org/markup-compatibility/2006" xmlns:aink="http://schemas.microsoft.com/office/drawing/2016/ink" xmlns:am3d="http://schemas.microsoft.com/office/drawing/2017/model3d" xmlns:o="urn:schemas-microsoft-com:office:office" xmlns:oel="http://schemas.microsoft.com/office/2019/extlst" xmlns:r="http://schemas.openxmlformats.org/officeDocument/2006/relationships" xmlns:m="http://schemas.openxmlformats.org/officeDocument/2006/math" xmlns:v="urn:schemas-microsoft-com:vml" xmlns:wp14="http://schemas.microsoft.com/office/word/2010/wordprocessingDrawing" xmlns:wp="http://schemas.openxmlformats.org/drawingml/2006/wordprocessingDrawing" xmlns:w10="urn:schemas-microsoft-com:office:word" xmlns:w="http://schemas.openxmlformats.org/wordprocessingml/2006/main" xmlns:w14="http://schemas.microsoft.com/office/word/2010/wordml" xmlns:w15="http://schemas.microsoft.com/office/word/2012/wordml" xmlns:w16cex="http://schemas.microsoft.com/office/word/2018/wordml/cex" xmlns:w16cid="http://schemas.microsoft.com/office/word/2016/wordml/cid" xmlns:w16="http://schemas.microsoft.com/office/word/2018/wordml" xmlns:w16sdtdh="http://schemas.microsoft.com/office/word/2020/wordml/sdtdatahash" xmlns:w16se="http://schemas.microsoft.com/office/word/2015/wordml/symex" xmlns:wpg="http://schemas.microsoft.com/office/word/2010/wordprocessingGroup" xmlns:wpi="http://schemas.microsoft.com/office/word/2010/wordprocessingInk" xmlns:wne="http://schemas.microsoft.com/office/word/2006/wordml" xmlns:wps="http://schemas.microsoft.com/office/word/2010/wordprocessingShape" mc:Ignorable="w14 w15 w16se w16cid w16 w16cex w16sdtdh wp14">
+<w16cid:commentsIds xmlns:wpc="http://schemas.microsoft.com/office/word/2010/wordprocessingCanvas" xmlns:cx="http://schemas.microsoft.com/office/drawing/2014/chartex" xmlns:cx1="http://schemas.microsoft.com/office/drawing/2015/9/8/chartex" xmlns:cx2="http://schemas.microsoft.com/office/drawing/2015/10/21/chartex" xmlns:cx3="http://schemas.microsoft.com/office/drawing/2016/5/9/chartex" xmlns:cx4="http://schemas.microsoft.com/office/drawing/2016/5/10/chartex" xmlns:cx5="http://schemas.microsoft.com/office/drawing/2016/5/11/chartex" xmlns:cx6="http://schemas.microsoft.com/office/drawing/2016/5/12/chartex" xmlns:cx7="http://schemas.microsoft.com/office/drawing/2016/5/13/chartex" xmlns:cx8="http://schemas.microsoft.com/office/drawing/2016/5/14/chartex" xmlns:mc="http://schemas.openxmlformats.org/markup-compatibility/2006" xmlns:aink="http://schemas.microsoft.com/office/drawing/2016/ink" xmlns:am3d="http://schemas.microsoft.com/office/drawing/2017/model3d" xmlns:o="urn:schemas-microsoft-com:office:office" xmlns:oel="http://schemas.microsoft.com/office/2019/extlst" xmlns:r="http://schemas.openxmlformats.org/officeDocument/2006/relationships" xmlns:m="http://schemas.openxmlformats.org/officeDocument/2006/math" xmlns:v="urn:schemas-microsoft-com:vml" xmlns:wp14="http://schemas.microsoft.com/office/word/2010/wordprocessingDrawing" xmlns:wp="http://schemas.openxmlformats.org/drawingml/2006/wordprocessingDrawing" xmlns:w10="urn:schemas-microsoft-com:office:word" xmlns:w="http://schemas.openxmlformats.org/wordprocessingml/2006/main" xmlns:w14="http://schemas.microsoft.com/office/word/2010/wordml" xmlns:w15="http://schemas.microsoft.com/office/word/2012/wordml" xmlns:w16cex="http://schemas.microsoft.com/office/word/2018/wordml/cex" xmlns:w16cid="http://schemas.microsoft.com/office/word/2016/wordml/cid" xmlns:w16="http://schemas.microsoft.com/office/word/2018/wordml" xmlns:w16du="http://schemas.microsoft.com/office/word/2023/wordml/word16du" xmlns:w16sdtdh="http://schemas.microsoft.com/office/word/2020/wordml/sdtdatahash" xmlns:w16sdtfl="http://schemas.microsoft.com/office/word/2024/wordml/sdtformatlock" xmlns:w16se="http://schemas.microsoft.com/office/word/2015/wordml/symex" xmlns:wpg="http://schemas.microsoft.com/office/word/2010/wordprocessingGroup" xmlns:wpi="http://schemas.microsoft.com/office/word/2010/wordprocessingInk" xmlns:wne="http://schemas.microsoft.com/office/word/2006/wordml" xmlns:wps="http://schemas.microsoft.com/office/word/2010/wordprocessingShape" mc:Ignorable="w14 w15 w16se w16cid w16 w16cex w16sdtdh w16sdtfl w16du wp14">
   <w16cid:commentId w16cid:paraId="644CF8CC" w16cid:durableId="69BBF6BB"/>
   <w16cid:commentId w16cid:paraId="0B8DE079" w16cid:durableId="03BA2934"/>
   <w16cid:commentId w16cid:paraId="1B3851F4" w16cid:durableId="38805649"/>
@@ -11132,7 +11137,7 @@
 </file>
 
 <file path=word/endnotes.xml><?xml version="1.0" encoding="utf-8"?>
-<w:endnotes xmlns:wpc="http://schemas.microsoft.com/office/word/2010/wordprocessingCanvas" xmlns:cx="http://schemas.microsoft.com/office/drawing/2014/chartex" xmlns:cx1="http://schemas.microsoft.com/office/drawing/2015/9/8/chartex" xmlns:cx2="http://schemas.microsoft.com/office/drawing/2015/10/21/chartex" xmlns:cx3="http://schemas.microsoft.com/office/drawing/2016/5/9/chartex" xmlns:cx4="http://schemas.microsoft.com/office/drawing/2016/5/10/chartex" xmlns:cx5="http://schemas.microsoft.com/office/drawing/2016/5/11/chartex" xmlns:cx6="http://schemas.microsoft.com/office/drawing/2016/5/12/chartex" xmlns:cx7="http://schemas.microsoft.com/office/drawing/2016/5/13/chartex" xmlns:cx8="http://schemas.microsoft.com/office/drawing/2016/5/14/chartex" xmlns:mc="http://schemas.openxmlformats.org/markup-compatibility/2006" xmlns:aink="http://schemas.microsoft.com/office/drawing/2016/ink" xmlns:am3d="http://schemas.microsoft.com/office/drawing/2017/model3d" xmlns:o="urn:schemas-microsoft-com:office:office" xmlns:oel="http://schemas.microsoft.com/office/2019/extlst" xmlns:r="http://schemas.openxmlformats.org/officeDocument/2006/relationships" xmlns:m="http://schemas.openxmlformats.org/officeDocument/2006/math" xmlns:v="urn:schemas-microsoft-com:vml" xmlns:wp14="http://schemas.microsoft.com/office/word/2010/wordprocessingDrawing" xmlns:wp="http://schemas.openxmlformats.org/drawingml/2006/wordprocessingDrawing" xmlns:w10="urn:schemas-microsoft-com:office:word" xmlns:w="http://schemas.openxmlformats.org/wordprocessingml/2006/main" xmlns:w14="http://schemas.microsoft.com/office/word/2010/wordml" xmlns:w15="http://schemas.microsoft.com/office/word/2012/wordml" xmlns:w16cex="http://schemas.microsoft.com/office/word/2018/wordml/cex" xmlns:w16cid="http://schemas.microsoft.com/office/word/2016/wordml/cid" xmlns:w16="http://schemas.microsoft.com/office/word/2018/wordml" xmlns:w16sdtdh="http://schemas.microsoft.com/office/word/2020/wordml/sdtdatahash" xmlns:w16se="http://schemas.microsoft.com/office/word/2015/wordml/symex" xmlns:wpg="http://schemas.microsoft.com/office/word/2010/wordprocessingGroup" xmlns:wpi="http://schemas.microsoft.com/office/word/2010/wordprocessingInk" xmlns:wne="http://schemas.microsoft.com/office/word/2006/wordml" xmlns:wps="http://schemas.microsoft.com/office/word/2010/wordprocessingShape" mc:Ignorable="w14 w15 w16se w16cid w16 w16cex w16sdtdh wp14">
+<w:endnotes xmlns:wpc="http://schemas.microsoft.com/office/word/2010/wordprocessingCanvas" xmlns:cx="http://schemas.microsoft.com/office/drawing/2014/chartex" xmlns:cx1="http://schemas.microsoft.com/office/drawing/2015/9/8/chartex" xmlns:cx2="http://schemas.microsoft.com/office/drawing/2015/10/21/chartex" xmlns:cx3="http://schemas.microsoft.com/office/drawing/2016/5/9/chartex" xmlns:cx4="http://schemas.microsoft.com/office/drawing/2016/5/10/chartex" xmlns:cx5="http://schemas.microsoft.com/office/drawing/2016/5/11/chartex" xmlns:cx6="http://schemas.microsoft.com/office/drawing/2016/5/12/chartex" xmlns:cx7="http://schemas.microsoft.com/office/drawing/2016/5/13/chartex" xmlns:cx8="http://schemas.microsoft.com/office/drawing/2016/5/14/chartex" xmlns:mc="http://schemas.openxmlformats.org/markup-compatibility/2006" xmlns:aink="http://schemas.microsoft.com/office/drawing/2016/ink" xmlns:am3d="http://schemas.microsoft.com/office/drawing/2017/model3d" xmlns:o="urn:schemas-microsoft-com:office:office" xmlns:oel="http://schemas.microsoft.com/office/2019/extlst" xmlns:r="http://schemas.openxmlformats.org/officeDocument/2006/relationships" xmlns:m="http://schemas.openxmlformats.org/officeDocument/2006/math" xmlns:v="urn:schemas-microsoft-com:vml" xmlns:wp14="http://schemas.microsoft.com/office/word/2010/wordprocessingDrawing" xmlns:wp="http://schemas.openxmlformats.org/drawingml/2006/wordprocessingDrawing" xmlns:w10="urn:schemas-microsoft-com:office:word" xmlns:w="http://schemas.openxmlformats.org/wordprocessingml/2006/main" xmlns:w14="http://schemas.microsoft.com/office/word/2010/wordml" xmlns:w15="http://schemas.microsoft.com/office/word/2012/wordml" xmlns:w16cex="http://schemas.microsoft.com/office/word/2018/wordml/cex" xmlns:w16cid="http://schemas.microsoft.com/office/word/2016/wordml/cid" xmlns:w16="http://schemas.microsoft.com/office/word/2018/wordml" xmlns:w16du="http://schemas.microsoft.com/office/word/2023/wordml/word16du" xmlns:w16sdtdh="http://schemas.microsoft.com/office/word/2020/wordml/sdtdatahash" xmlns:w16sdtfl="http://schemas.microsoft.com/office/word/2024/wordml/sdtformatlock" xmlns:w16se="http://schemas.microsoft.com/office/word/2015/wordml/symex" xmlns:wpg="http://schemas.microsoft.com/office/word/2010/wordprocessingGroup" xmlns:wpi="http://schemas.microsoft.com/office/word/2010/wordprocessingInk" xmlns:wne="http://schemas.microsoft.com/office/word/2006/wordml" xmlns:wps="http://schemas.microsoft.com/office/word/2010/wordprocessingShape" mc:Ignorable="w14 w15 w16se w16cid w16 w16cex w16sdtdh w16sdtfl w16du wp14">
   <w:endnote w:type="separator" w:id="-1">
     <w:p>
       <w:r>
@@ -11151,7 +11156,7 @@
 </file>
 
 <file path=word/footer1.xml><?xml version="1.0" encoding="utf-8"?>
-<w:ftr xmlns:wpc="http://schemas.microsoft.com/office/word/2010/wordprocessingCanvas" xmlns:cx="http://schemas.microsoft.com/office/drawing/2014/chartex" xmlns:cx1="http://schemas.microsoft.com/office/drawing/2015/9/8/chartex" xmlns:cx2="http://schemas.microsoft.com/office/drawing/2015/10/21/chartex" xmlns:cx3="http://schemas.microsoft.com/office/drawing/2016/5/9/chartex" xmlns:cx4="http://schemas.microsoft.com/office/drawing/2016/5/10/chartex" xmlns:cx5="http://schemas.microsoft.com/office/drawing/2016/5/11/chartex" xmlns:cx6="http://schemas.microsoft.com/office/drawing/2016/5/12/chartex" xmlns:cx7="http://schemas.microsoft.com/office/drawing/2016/5/13/chartex" xmlns:cx8="http://schemas.microsoft.com/office/drawing/2016/5/14/chartex" xmlns:mc="http://schemas.openxmlformats.org/markup-compatibility/2006" xmlns:aink="http://schemas.microsoft.com/office/drawing/2016/ink" xmlns:am3d="http://schemas.microsoft.com/office/drawing/2017/model3d" xmlns:o="urn:schemas-microsoft-com:office:office" xmlns:oel="http://schemas.microsoft.com/office/2019/extlst" xmlns:r="http://schemas.openxmlformats.org/officeDocument/2006/relationships" xmlns:m="http://schemas.openxmlformats.org/officeDocument/2006/math" xmlns:v="urn:schemas-microsoft-com:vml" xmlns:wp14="http://schemas.microsoft.com/office/word/2010/wordprocessingDrawing" xmlns:wp="http://schemas.openxmlformats.org/drawingml/2006/wordprocessingDrawing" xmlns:w10="urn:schemas-microsoft-com:office:word" xmlns:w="http://schemas.openxmlformats.org/wordprocessingml/2006/main" xmlns:w14="http://schemas.microsoft.com/office/word/2010/wordml" xmlns:w15="http://schemas.microsoft.com/office/word/2012/wordml" xmlns:w16cex="http://schemas.microsoft.com/office/word/2018/wordml/cex" xmlns:w16cid="http://schemas.microsoft.com/office/word/2016/wordml/cid" xmlns:w16="http://schemas.microsoft.com/office/word/2018/wordml" xmlns:w16sdtdh="http://schemas.microsoft.com/office/word/2020/wordml/sdtdatahash" xmlns:w16se="http://schemas.microsoft.com/office/word/2015/wordml/symex" xmlns:wpg="http://schemas.microsoft.com/office/word/2010/wordprocessingGroup" xmlns:wpi="http://schemas.microsoft.com/office/word/2010/wordprocessingInk" xmlns:wne="http://schemas.microsoft.com/office/word/2006/wordml" xmlns:wps="http://schemas.microsoft.com/office/word/2010/wordprocessingShape" mc:Ignorable="w14 w15 w16se w16cid w16 w16cex w16sdtdh wp14">
+<w:ftr xmlns:wpc="http://schemas.microsoft.com/office/word/2010/wordprocessingCanvas" xmlns:cx="http://schemas.microsoft.com/office/drawing/2014/chartex" xmlns:cx1="http://schemas.microsoft.com/office/drawing/2015/9/8/chartex" xmlns:cx2="http://schemas.microsoft.com/office/drawing/2015/10/21/chartex" xmlns:cx3="http://schemas.microsoft.com/office/drawing/2016/5/9/chartex" xmlns:cx4="http://schemas.microsoft.com/office/drawing/2016/5/10/chartex" xmlns:cx5="http://schemas.microsoft.com/office/drawing/2016/5/11/chartex" xmlns:cx6="http://schemas.microsoft.com/office/drawing/2016/5/12/chartex" xmlns:cx7="http://schemas.microsoft.com/office/drawing/2016/5/13/chartex" xmlns:cx8="http://schemas.microsoft.com/office/drawing/2016/5/14/chartex" xmlns:mc="http://schemas.openxmlformats.org/markup-compatibility/2006" xmlns:aink="http://schemas.microsoft.com/office/drawing/2016/ink" xmlns:am3d="http://schemas.microsoft.com/office/drawing/2017/model3d" xmlns:o="urn:schemas-microsoft-com:office:office" xmlns:oel="http://schemas.microsoft.com/office/2019/extlst" xmlns:r="http://schemas.openxmlformats.org/officeDocument/2006/relationships" xmlns:m="http://schemas.openxmlformats.org/officeDocument/2006/math" xmlns:v="urn:schemas-microsoft-com:vml" xmlns:wp14="http://schemas.microsoft.com/office/word/2010/wordprocessingDrawing" xmlns:wp="http://schemas.openxmlformats.org/drawingml/2006/wordprocessingDrawing" xmlns:w10="urn:schemas-microsoft-com:office:word" xmlns:w="http://schemas.openxmlformats.org/wordprocessingml/2006/main" xmlns:w14="http://schemas.microsoft.com/office/word/2010/wordml" xmlns:w15="http://schemas.microsoft.com/office/word/2012/wordml" xmlns:w16cex="http://schemas.microsoft.com/office/word/2018/wordml/cex" xmlns:w16cid="http://schemas.microsoft.com/office/word/2016/wordml/cid" xmlns:w16="http://schemas.microsoft.com/office/word/2018/wordml" xmlns:w16du="http://schemas.microsoft.com/office/word/2023/wordml/word16du" xmlns:w16sdtdh="http://schemas.microsoft.com/office/word/2020/wordml/sdtdatahash" xmlns:w16sdtfl="http://schemas.microsoft.com/office/word/2024/wordml/sdtformatlock" xmlns:w16se="http://schemas.microsoft.com/office/word/2015/wordml/symex" xmlns:wpg="http://schemas.microsoft.com/office/word/2010/wordprocessingGroup" xmlns:wpi="http://schemas.microsoft.com/office/word/2010/wordprocessingInk" xmlns:wne="http://schemas.microsoft.com/office/word/2006/wordml" xmlns:wps="http://schemas.microsoft.com/office/word/2010/wordprocessingShape" mc:Ignorable="w14 w15 w16se w16cid w16 w16cex w16sdtdh w16sdtfl w16du wp14">
   <w:p>
     <w:pPr>
       <w:pStyle w:val="a6"/>
@@ -11161,7 +11166,7 @@
 </file>
 
 <file path=word/footer2.xml><?xml version="1.0" encoding="utf-8"?>
-<w:ftr xmlns:wpc="http://schemas.microsoft.com/office/word/2010/wordprocessingCanvas" xmlns:cx="http://schemas.microsoft.com/office/drawing/2014/chartex" xmlns:cx1="http://schemas.microsoft.com/office/drawing/2015/9/8/chartex" xmlns:cx2="http://schemas.microsoft.com/office/drawing/2015/10/21/chartex" xmlns:cx3="http://schemas.microsoft.com/office/drawing/2016/5/9/chartex" xmlns:cx4="http://schemas.microsoft.com/office/drawing/2016/5/10/chartex" xmlns:cx5="http://schemas.microsoft.com/office/drawing/2016/5/11/chartex" xmlns:cx6="http://schemas.microsoft.com/office/drawing/2016/5/12/chartex" xmlns:cx7="http://schemas.microsoft.com/office/drawing/2016/5/13/chartex" xmlns:cx8="http://schemas.microsoft.com/office/drawing/2016/5/14/chartex" xmlns:mc="http://schemas.openxmlformats.org/markup-compatibility/2006" xmlns:aink="http://schemas.microsoft.com/office/drawing/2016/ink" xmlns:am3d="http://schemas.microsoft.com/office/drawing/2017/model3d" xmlns:o="urn:schemas-microsoft-com:office:office" xmlns:oel="http://schemas.microsoft.com/office/2019/extlst" xmlns:r="http://schemas.openxmlformats.org/officeDocument/2006/relationships" xmlns:m="http://schemas.openxmlformats.org/officeDocument/2006/math" xmlns:v="urn:schemas-microsoft-com:vml" xmlns:wp14="http://schemas.microsoft.com/office/word/2010/wordprocessingDrawing" xmlns:wp="http://schemas.openxmlformats.org/drawingml/2006/wordprocessingDrawing" xmlns:w10="urn:schemas-microsoft-com:office:word" xmlns:w="http://schemas.openxmlformats.org/wordprocessingml/2006/main" xmlns:w14="http://schemas.microsoft.com/office/word/2010/wordml" xmlns:w15="http://schemas.microsoft.com/office/word/2012/wordml" xmlns:w16cex="http://schemas.microsoft.com/office/word/2018/wordml/cex" xmlns:w16cid="http://schemas.microsoft.com/office/word/2016/wordml/cid" xmlns:w16="http://schemas.microsoft.com/office/word/2018/wordml" xmlns:w16sdtdh="http://schemas.microsoft.com/office/word/2020/wordml/sdtdatahash" xmlns:w16se="http://schemas.microsoft.com/office/word/2015/wordml/symex" xmlns:wpg="http://schemas.microsoft.com/office/word/2010/wordprocessingGroup" xmlns:wpi="http://schemas.microsoft.com/office/word/2010/wordprocessingInk" xmlns:wne="http://schemas.microsoft.com/office/word/2006/wordml" xmlns:wps="http://schemas.microsoft.com/office/word/2010/wordprocessingShape" mc:Ignorable="w14 w15 w16se w16cid w16 w16cex w16sdtdh wp14">
+<w:ftr xmlns:wpc="http://schemas.microsoft.com/office/word/2010/wordprocessingCanvas" xmlns:cx="http://schemas.microsoft.com/office/drawing/2014/chartex" xmlns:cx1="http://schemas.microsoft.com/office/drawing/2015/9/8/chartex" xmlns:cx2="http://schemas.microsoft.com/office/drawing/2015/10/21/chartex" xmlns:cx3="http://schemas.microsoft.com/office/drawing/2016/5/9/chartex" xmlns:cx4="http://schemas.microsoft.com/office/drawing/2016/5/10/chartex" xmlns:cx5="http://schemas.microsoft.com/office/drawing/2016/5/11/chartex" xmlns:cx6="http://schemas.microsoft.com/office/drawing/2016/5/12/chartex" xmlns:cx7="http://schemas.microsoft.com/office/drawing/2016/5/13/chartex" xmlns:cx8="http://schemas.microsoft.com/office/drawing/2016/5/14/chartex" xmlns:mc="http://schemas.openxmlformats.org/markup-compatibility/2006" xmlns:aink="http://schemas.microsoft.com/office/drawing/2016/ink" xmlns:am3d="http://schemas.microsoft.com/office/drawing/2017/model3d" xmlns:o="urn:schemas-microsoft-com:office:office" xmlns:oel="http://schemas.microsoft.com/office/2019/extlst" xmlns:r="http://schemas.openxmlformats.org/officeDocument/2006/relationships" xmlns:m="http://schemas.openxmlformats.org/officeDocument/2006/math" xmlns:v="urn:schemas-microsoft-com:vml" xmlns:wp14="http://schemas.microsoft.com/office/word/2010/wordprocessingDrawing" xmlns:wp="http://schemas.openxmlformats.org/drawingml/2006/wordprocessingDrawing" xmlns:w10="urn:schemas-microsoft-com:office:word" xmlns:w="http://schemas.openxmlformats.org/wordprocessingml/2006/main" xmlns:w14="http://schemas.microsoft.com/office/word/2010/wordml" xmlns:w15="http://schemas.microsoft.com/office/word/2012/wordml" xmlns:w16cex="http://schemas.microsoft.com/office/word/2018/wordml/cex" xmlns:w16cid="http://schemas.microsoft.com/office/word/2016/wordml/cid" xmlns:w16="http://schemas.microsoft.com/office/word/2018/wordml" xmlns:w16du="http://schemas.microsoft.com/office/word/2023/wordml/word16du" xmlns:w16sdtdh="http://schemas.microsoft.com/office/word/2020/wordml/sdtdatahash" xmlns:w16sdtfl="http://schemas.microsoft.com/office/word/2024/wordml/sdtformatlock" xmlns:w16se="http://schemas.microsoft.com/office/word/2015/wordml/symex" xmlns:wpg="http://schemas.microsoft.com/office/word/2010/wordprocessingGroup" xmlns:wpi="http://schemas.microsoft.com/office/word/2010/wordprocessingInk" xmlns:wne="http://schemas.microsoft.com/office/word/2006/wordml" xmlns:wps="http://schemas.microsoft.com/office/word/2010/wordprocessingShape" mc:Ignorable="w14 w15 w16se w16cid w16 w16cex w16sdtdh w16sdtfl w16du wp14">
   <w:p>
     <w:pPr>
       <w:pStyle w:val="a6"/>
@@ -11171,7 +11176,7 @@
 </file>
 
 <file path=word/footer3.xml><?xml version="1.0" encoding="utf-8"?>
-<w:ftr xmlns:wpc="http://schemas.microsoft.com/office/word/2010/wordprocessingCanvas" xmlns:cx="http://schemas.microsoft.com/office/drawing/2014/chartex" xmlns:cx1="http://schemas.microsoft.com/office/drawing/2015/9/8/chartex" xmlns:cx2="http://schemas.microsoft.com/office/drawing/2015/10/21/chartex" xmlns:cx3="http://schemas.microsoft.com/office/drawing/2016/5/9/chartex" xmlns:cx4="http://schemas.microsoft.com/office/drawing/2016/5/10/chartex" xmlns:cx5="http://schemas.microsoft.com/office/drawing/2016/5/11/chartex" xmlns:cx6="http://schemas.microsoft.com/office/drawing/2016/5/12/chartex" xmlns:cx7="http://schemas.microsoft.com/office/drawing/2016/5/13/chartex" xmlns:cx8="http://schemas.microsoft.com/office/drawing/2016/5/14/chartex" xmlns:mc="http://schemas.openxmlformats.org/markup-compatibility/2006" xmlns:aink="http://schemas.microsoft.com/office/drawing/2016/ink" xmlns:am3d="http://schemas.microsoft.com/office/drawing/2017/model3d" xmlns:o="urn:schemas-microsoft-com:office:office" xmlns:oel="http://schemas.microsoft.com/office/2019/extlst" xmlns:r="http://schemas.openxmlformats.org/officeDocument/2006/relationships" xmlns:m="http://schemas.openxmlformats.org/officeDocument/2006/math" xmlns:v="urn:schemas-microsoft-com:vml" xmlns:wp14="http://schemas.microsoft.com/office/word/2010/wordprocessingDrawing" xmlns:wp="http://schemas.openxmlformats.org/drawingml/2006/wordprocessingDrawing" xmlns:w10="urn:schemas-microsoft-com:office:word" xmlns:w="http://schemas.openxmlformats.org/wordprocessingml/2006/main" xmlns:w14="http://schemas.microsoft.com/office/word/2010/wordml" xmlns:w15="http://schemas.microsoft.com/office/word/2012/wordml" xmlns:w16cex="http://schemas.microsoft.com/office/word/2018/wordml/cex" xmlns:w16cid="http://schemas.microsoft.com/office/word/2016/wordml/cid" xmlns:w16="http://schemas.microsoft.com/office/word/2018/wordml" xmlns:w16sdtdh="http://schemas.microsoft.com/office/word/2020/wordml/sdtdatahash" xmlns:w16se="http://schemas.microsoft.com/office/word/2015/wordml/symex" xmlns:wpg="http://schemas.microsoft.com/office/word/2010/wordprocessingGroup" xmlns:wpi="http://schemas.microsoft.com/office/word/2010/wordprocessingInk" xmlns:wne="http://schemas.microsoft.com/office/word/2006/wordml" xmlns:wps="http://schemas.microsoft.com/office/word/2010/wordprocessingShape" mc:Ignorable="w14 w15 w16se w16cid w16 w16cex w16sdtdh wp14">
+<w:ftr xmlns:wpc="http://schemas.microsoft.com/office/word/2010/wordprocessingCanvas" xmlns:cx="http://schemas.microsoft.com/office/drawing/2014/chartex" xmlns:cx1="http://schemas.microsoft.com/office/drawing/2015/9/8/chartex" xmlns:cx2="http://schemas.microsoft.com/office/drawing/2015/10/21/chartex" xmlns:cx3="http://schemas.microsoft.com/office/drawing/2016/5/9/chartex" xmlns:cx4="http://schemas.microsoft.com/office/drawing/2016/5/10/chartex" xmlns:cx5="http://schemas.microsoft.com/office/drawing/2016/5/11/chartex" xmlns:cx6="http://schemas.microsoft.com/office/drawing/2016/5/12/chartex" xmlns:cx7="http://schemas.microsoft.com/office/drawing/2016/5/13/chartex" xmlns:cx8="http://schemas.microsoft.com/office/drawing/2016/5/14/chartex" xmlns:mc="http://schemas.openxmlformats.org/markup-compatibility/2006" xmlns:aink="http://schemas.microsoft.com/office/drawing/2016/ink" xmlns:am3d="http://schemas.microsoft.com/office/drawing/2017/model3d" xmlns:o="urn:schemas-microsoft-com:office:office" xmlns:oel="http://schemas.microsoft.com/office/2019/extlst" xmlns:r="http://schemas.openxmlformats.org/officeDocument/2006/relationships" xmlns:m="http://schemas.openxmlformats.org/officeDocument/2006/math" xmlns:v="urn:schemas-microsoft-com:vml" xmlns:wp14="http://schemas.microsoft.com/office/word/2010/wordprocessingDrawing" xmlns:wp="http://schemas.openxmlformats.org/drawingml/2006/wordprocessingDrawing" xmlns:w10="urn:schemas-microsoft-com:office:word" xmlns:w="http://schemas.openxmlformats.org/wordprocessingml/2006/main" xmlns:w14="http://schemas.microsoft.com/office/word/2010/wordml" xmlns:w15="http://schemas.microsoft.com/office/word/2012/wordml" xmlns:w16cex="http://schemas.microsoft.com/office/word/2018/wordml/cex" xmlns:w16cid="http://schemas.microsoft.com/office/word/2016/wordml/cid" xmlns:w16="http://schemas.microsoft.com/office/word/2018/wordml" xmlns:w16du="http://schemas.microsoft.com/office/word/2023/wordml/word16du" xmlns:w16sdtdh="http://schemas.microsoft.com/office/word/2020/wordml/sdtdatahash" xmlns:w16sdtfl="http://schemas.microsoft.com/office/word/2024/wordml/sdtformatlock" xmlns:w16se="http://schemas.microsoft.com/office/word/2015/wordml/symex" xmlns:wpg="http://schemas.microsoft.com/office/word/2010/wordprocessingGroup" xmlns:wpi="http://schemas.microsoft.com/office/word/2010/wordprocessingInk" xmlns:wne="http://schemas.microsoft.com/office/word/2006/wordml" xmlns:wps="http://schemas.microsoft.com/office/word/2010/wordprocessingShape" mc:Ignorable="w14 w15 w16se w16cid w16 w16cex w16sdtdh w16sdtfl w16du wp14">
   <w:p>
     <w:pPr>
       <w:pStyle w:val="a6"/>
@@ -11205,7 +11210,7 @@
 </file>
 
 <file path=word/footnotes.xml><?xml version="1.0" encoding="utf-8"?>
-<w:footnotes xmlns:wpc="http://schemas.microsoft.com/office/word/2010/wordprocessingCanvas" xmlns:cx="http://schemas.microsoft.com/office/drawing/2014/chartex" xmlns:cx1="http://schemas.microsoft.com/office/drawing/2015/9/8/chartex" xmlns:cx2="http://schemas.microsoft.com/office/drawing/2015/10/21/chartex" xmlns:cx3="http://schemas.microsoft.com/office/drawing/2016/5/9/chartex" xmlns:cx4="http://schemas.microsoft.com/office/drawing/2016/5/10/chartex" xmlns:cx5="http://schemas.microsoft.com/office/drawing/2016/5/11/chartex" xmlns:cx6="http://schemas.microsoft.com/office/drawing/2016/5/12/chartex" xmlns:cx7="http://schemas.microsoft.com/office/drawing/2016/5/13/chartex" xmlns:cx8="http://schemas.microsoft.com/office/drawing/2016/5/14/chartex" xmlns:mc="http://schemas.openxmlformats.org/markup-compatibility/2006" xmlns:aink="http://schemas.microsoft.com/office/drawing/2016/ink" xmlns:am3d="http://schemas.microsoft.com/office/drawing/2017/model3d" xmlns:o="urn:schemas-microsoft-com:office:office" xmlns:oel="http://schemas.microsoft.com/office/2019/extlst" xmlns:r="http://schemas.openxmlformats.org/officeDocument/2006/relationships" xmlns:m="http://schemas.openxmlformats.org/officeDocument/2006/math" xmlns:v="urn:schemas-microsoft-com:vml" xmlns:wp14="http://schemas.microsoft.com/office/word/2010/wordprocessingDrawing" xmlns:wp="http://schemas.openxmlformats.org/drawingml/2006/wordprocessingDrawing" xmlns:w10="urn:schemas-microsoft-com:office:word" xmlns:w="http://schemas.openxmlformats.org/wordprocessingml/2006/main" xmlns:w14="http://schemas.microsoft.com/office/word/2010/wordml" xmlns:w15="http://schemas.microsoft.com/office/word/2012/wordml" xmlns:w16cex="http://schemas.microsoft.com/office/word/2018/wordml/cex" xmlns:w16cid="http://schemas.microsoft.com/office/word/2016/wordml/cid" xmlns:w16="http://schemas.microsoft.com/office/word/2018/wordml" xmlns:w16sdtdh="http://schemas.microsoft.com/office/word/2020/wordml/sdtdatahash" xmlns:w16se="http://schemas.microsoft.com/office/word/2015/wordml/symex" xmlns:wpg="http://schemas.microsoft.com/office/word/2010/wordprocessingGroup" xmlns:wpi="http://schemas.microsoft.com/office/word/2010/wordprocessingInk" xmlns:wne="http://schemas.microsoft.com/office/word/2006/wordml" xmlns:wps="http://schemas.microsoft.com/office/word/2010/wordprocessingShape" mc:Ignorable="w14 w15 w16se w16cid w16 w16cex w16sdtdh wp14">
+<w:footnotes xmlns:wpc="http://schemas.microsoft.com/office/word/2010/wordprocessingCanvas" xmlns:cx="http://schemas.microsoft.com/office/drawing/2014/chartex" xmlns:cx1="http://schemas.microsoft.com/office/drawing/2015/9/8/chartex" xmlns:cx2="http://schemas.microsoft.com/office/drawing/2015/10/21/chartex" xmlns:cx3="http://schemas.microsoft.com/office/drawing/2016/5/9/chartex" xmlns:cx4="http://schemas.microsoft.com/office/drawing/2016/5/10/chartex" xmlns:cx5="http://schemas.microsoft.com/office/drawing/2016/5/11/chartex" xmlns:cx6="http://schemas.microsoft.com/office/drawing/2016/5/12/chartex" xmlns:cx7="http://schemas.microsoft.com/office/drawing/2016/5/13/chartex" xmlns:cx8="http://schemas.microsoft.com/office/drawing/2016/5/14/chartex" xmlns:mc="http://schemas.openxmlformats.org/markup-compatibility/2006" xmlns:aink="http://schemas.microsoft.com/office/drawing/2016/ink" xmlns:am3d="http://schemas.microsoft.com/office/drawing/2017/model3d" xmlns:o="urn:schemas-microsoft-com:office:office" xmlns:oel="http://schemas.microsoft.com/office/2019/extlst" xmlns:r="http://schemas.openxmlformats.org/officeDocument/2006/relationships" xmlns:m="http://schemas.openxmlformats.org/officeDocument/2006/math" xmlns:v="urn:schemas-microsoft-com:vml" xmlns:wp14="http://schemas.microsoft.com/office/word/2010/wordprocessingDrawing" xmlns:wp="http://schemas.openxmlformats.org/drawingml/2006/wordprocessingDrawing" xmlns:w10="urn:schemas-microsoft-com:office:word" xmlns:w="http://schemas.openxmlformats.org/wordprocessingml/2006/main" xmlns:w14="http://schemas.microsoft.com/office/word/2010/wordml" xmlns:w15="http://schemas.microsoft.com/office/word/2012/wordml" xmlns:w16cex="http://schemas.microsoft.com/office/word/2018/wordml/cex" xmlns:w16cid="http://schemas.microsoft.com/office/word/2016/wordml/cid" xmlns:w16="http://schemas.microsoft.com/office/word/2018/wordml" xmlns:w16du="http://schemas.microsoft.com/office/word/2023/wordml/word16du" xmlns:w16sdtdh="http://schemas.microsoft.com/office/word/2020/wordml/sdtdatahash" xmlns:w16sdtfl="http://schemas.microsoft.com/office/word/2024/wordml/sdtformatlock" xmlns:w16se="http://schemas.microsoft.com/office/word/2015/wordml/symex" xmlns:wpg="http://schemas.microsoft.com/office/word/2010/wordprocessingGroup" xmlns:wpi="http://schemas.microsoft.com/office/word/2010/wordprocessingInk" xmlns:wne="http://schemas.microsoft.com/office/word/2006/wordml" xmlns:wps="http://schemas.microsoft.com/office/word/2010/wordprocessingShape" mc:Ignorable="w14 w15 w16se w16cid w16 w16cex w16sdtdh w16sdtfl w16du wp14">
   <w:footnote w:type="separator" w:id="-1">
     <w:p>
       <w:r>
@@ -11224,7 +11229,7 @@
 </file>
 
 <file path=word/header1.xml><?xml version="1.0" encoding="utf-8"?>
-<w:hdr xmlns:wpc="http://schemas.microsoft.com/office/word/2010/wordprocessingCanvas" xmlns:cx="http://schemas.microsoft.com/office/drawing/2014/chartex" xmlns:cx1="http://schemas.microsoft.com/office/drawing/2015/9/8/chartex" xmlns:cx2="http://schemas.microsoft.com/office/drawing/2015/10/21/chartex" xmlns:cx3="http://schemas.microsoft.com/office/drawing/2016/5/9/chartex" xmlns:cx4="http://schemas.microsoft.com/office/drawing/2016/5/10/chartex" xmlns:cx5="http://schemas.microsoft.com/office/drawing/2016/5/11/chartex" xmlns:cx6="http://schemas.microsoft.com/office/drawing/2016/5/12/chartex" xmlns:cx7="http://schemas.microsoft.com/office/drawing/2016/5/13/chartex" xmlns:cx8="http://schemas.microsoft.com/office/drawing/2016/5/14/chartex" xmlns:mc="http://schemas.openxmlformats.org/markup-compatibility/2006" xmlns:aink="http://schemas.microsoft.com/office/drawing/2016/ink" xmlns:am3d="http://schemas.microsoft.com/office/drawing/2017/model3d" xmlns:o="urn:schemas-microsoft-com:office:office" xmlns:oel="http://schemas.microsoft.com/office/2019/extlst" xmlns:r="http://schemas.openxmlformats.org/officeDocument/2006/relationships" xmlns:m="http://schemas.openxmlformats.org/officeDocument/2006/math" xmlns:v="urn:schemas-microsoft-com:vml" xmlns:wp14="http://schemas.microsoft.com/office/word/2010/wordprocessingDrawing" xmlns:wp="http://schemas.openxmlformats.org/drawingml/2006/wordprocessingDrawing" xmlns:w10="urn:schemas-microsoft-com:office:word" xmlns:w="http://schemas.openxmlformats.org/wordprocessingml/2006/main" xmlns:w14="http://schemas.microsoft.com/office/word/2010/wordml" xmlns:w15="http://schemas.microsoft.com/office/word/2012/wordml" xmlns:w16cex="http://schemas.microsoft.com/office/word/2018/wordml/cex" xmlns:w16cid="http://schemas.microsoft.com/office/word/2016/wordml/cid" xmlns:w16="http://schemas.microsoft.com/office/word/2018/wordml" xmlns:w16sdtdh="http://schemas.microsoft.com/office/word/2020/wordml/sdtdatahash" xmlns:w16se="http://schemas.microsoft.com/office/word/2015/wordml/symex" xmlns:wpg="http://schemas.microsoft.com/office/word/2010/wordprocessingGroup" xmlns:wpi="http://schemas.microsoft.com/office/word/2010/wordprocessingInk" xmlns:wne="http://schemas.microsoft.com/office/word/2006/wordml" xmlns:wps="http://schemas.microsoft.com/office/word/2010/wordprocessingShape" mc:Ignorable="w14 w15 w16se w16cid w16 w16cex w16sdtdh wp14">
+<w:hdr xmlns:wpc="http://schemas.microsoft.com/office/word/2010/wordprocessingCanvas" xmlns:cx="http://schemas.microsoft.com/office/drawing/2014/chartex" xmlns:cx1="http://schemas.microsoft.com/office/drawing/2015/9/8/chartex" xmlns:cx2="http://schemas.microsoft.com/office/drawing/2015/10/21/chartex" xmlns:cx3="http://schemas.microsoft.com/office/drawing/2016/5/9/chartex" xmlns:cx4="http://schemas.microsoft.com/office/drawing/2016/5/10/chartex" xmlns:cx5="http://schemas.microsoft.com/office/drawing/2016/5/11/chartex" xmlns:cx6="http://schemas.microsoft.com/office/drawing/2016/5/12/chartex" xmlns:cx7="http://schemas.microsoft.com/office/drawing/2016/5/13/chartex" xmlns:cx8="http://schemas.microsoft.com/office/drawing/2016/5/14/chartex" xmlns:mc="http://schemas.openxmlformats.org/markup-compatibility/2006" xmlns:aink="http://schemas.microsoft.com/office/drawing/2016/ink" xmlns:am3d="http://schemas.microsoft.com/office/drawing/2017/model3d" xmlns:o="urn:schemas-microsoft-com:office:office" xmlns:oel="http://schemas.microsoft.com/office/2019/extlst" xmlns:r="http://schemas.openxmlformats.org/officeDocument/2006/relationships" xmlns:m="http://schemas.openxmlformats.org/officeDocument/2006/math" xmlns:v="urn:schemas-microsoft-com:vml" xmlns:wp14="http://schemas.microsoft.com/office/word/2010/wordprocessingDrawing" xmlns:wp="http://schemas.openxmlformats.org/drawingml/2006/wordprocessingDrawing" xmlns:w10="urn:schemas-microsoft-com:office:word" xmlns:w="http://schemas.openxmlformats.org/wordprocessingml/2006/main" xmlns:w14="http://schemas.microsoft.com/office/word/2010/wordml" xmlns:w15="http://schemas.microsoft.com/office/word/2012/wordml" xmlns:w16cex="http://schemas.microsoft.com/office/word/2018/wordml/cex" xmlns:w16cid="http://schemas.microsoft.com/office/word/2016/wordml/cid" xmlns:w16="http://schemas.microsoft.com/office/word/2018/wordml" xmlns:w16du="http://schemas.microsoft.com/office/word/2023/wordml/word16du" xmlns:w16sdtdh="http://schemas.microsoft.com/office/word/2020/wordml/sdtdatahash" xmlns:w16sdtfl="http://schemas.microsoft.com/office/word/2024/wordml/sdtformatlock" xmlns:w16se="http://schemas.microsoft.com/office/word/2015/wordml/symex" xmlns:wpg="http://schemas.microsoft.com/office/word/2010/wordprocessingGroup" xmlns:wpi="http://schemas.microsoft.com/office/word/2010/wordprocessingInk" xmlns:wne="http://schemas.microsoft.com/office/word/2006/wordml" xmlns:wps="http://schemas.microsoft.com/office/word/2010/wordprocessingShape" mc:Ignorable="w14 w15 w16se w16cid w16 w16cex w16sdtdh w16sdtfl w16du wp14">
   <w:p>
     <w:pPr>
       <w:pStyle w:val="ae"/>
@@ -11234,7 +11239,7 @@
 </file>
 
 <file path=word/header2.xml><?xml version="1.0" encoding="utf-8"?>
-<w:hdr xmlns:wpc="http://schemas.microsoft.com/office/word/2010/wordprocessingCanvas" xmlns:cx="http://schemas.microsoft.com/office/drawing/2014/chartex" xmlns:cx1="http://schemas.microsoft.com/office/drawing/2015/9/8/chartex" xmlns:cx2="http://schemas.microsoft.com/office/drawing/2015/10/21/chartex" xmlns:cx3="http://schemas.microsoft.com/office/drawing/2016/5/9/chartex" xmlns:cx4="http://schemas.microsoft.com/office/drawing/2016/5/10/chartex" xmlns:cx5="http://schemas.microsoft.com/office/drawing/2016/5/11/chartex" xmlns:cx6="http://schemas.microsoft.com/office/drawing/2016/5/12/chartex" xmlns:cx7="http://schemas.microsoft.com/office/drawing/2016/5/13/chartex" xmlns:cx8="http://schemas.microsoft.com/office/drawing/2016/5/14/chartex" xmlns:mc="http://schemas.openxmlformats.org/markup-compatibility/2006" xmlns:aink="http://schemas.microsoft.com/office/drawing/2016/ink" xmlns:am3d="http://schemas.microsoft.com/office/drawing/2017/model3d" xmlns:o="urn:schemas-microsoft-com:office:office" xmlns:oel="http://schemas.microsoft.com/office/2019/extlst" xmlns:r="http://schemas.openxmlformats.org/officeDocument/2006/relationships" xmlns:m="http://schemas.openxmlformats.org/officeDocument/2006/math" xmlns:v="urn:schemas-microsoft-com:vml" xmlns:wp14="http://schemas.microsoft.com/office/word/2010/wordprocessingDrawing" xmlns:wp="http://schemas.openxmlformats.org/drawingml/2006/wordprocessingDrawing" xmlns:w10="urn:schemas-microsoft-com:office:word" xmlns:w="http://schemas.openxmlformats.org/wordprocessingml/2006/main" xmlns:w14="http://schemas.microsoft.com/office/word/2010/wordml" xmlns:w15="http://schemas.microsoft.com/office/word/2012/wordml" xmlns:w16cex="http://schemas.microsoft.com/office/word/2018/wordml/cex" xmlns:w16cid="http://schemas.microsoft.com/office/word/2016/wordml/cid" xmlns:w16="http://schemas.microsoft.com/office/word/2018/wordml" xmlns:w16sdtdh="http://schemas.microsoft.com/office/word/2020/wordml/sdtdatahash" xmlns:w16se="http://schemas.microsoft.com/office/word/2015/wordml/symex" xmlns:wpg="http://schemas.microsoft.com/office/word/2010/wordprocessingGroup" xmlns:wpi="http://schemas.microsoft.com/office/word/2010/wordprocessingInk" xmlns:wne="http://schemas.microsoft.com/office/word/2006/wordml" xmlns:wps="http://schemas.microsoft.com/office/word/2010/wordprocessingShape" mc:Ignorable="w14 w15 w16se w16cid w16 w16cex w16sdtdh wp14">
+<w:hdr xmlns:wpc="http://schemas.microsoft.com/office/word/2010/wordprocessingCanvas" xmlns:cx="http://schemas.microsoft.com/office/drawing/2014/chartex" xmlns:cx1="http://schemas.microsoft.com/office/drawing/2015/9/8/chartex" xmlns:cx2="http://schemas.microsoft.com/office/drawing/2015/10/21/chartex" xmlns:cx3="http://schemas.microsoft.com/office/drawing/2016/5/9/chartex" xmlns:cx4="http://schemas.microsoft.com/office/drawing/2016/5/10/chartex" xmlns:cx5="http://schemas.microsoft.com/office/drawing/2016/5/11/chartex" xmlns:cx6="http://schemas.microsoft.com/office/drawing/2016/5/12/chartex" xmlns:cx7="http://schemas.microsoft.com/office/drawing/2016/5/13/chartex" xmlns:cx8="http://schemas.microsoft.com/office/drawing/2016/5/14/chartex" xmlns:mc="http://schemas.openxmlformats.org/markup-compatibility/2006" xmlns:aink="http://schemas.microsoft.com/office/drawing/2016/ink" xmlns:am3d="http://schemas.microsoft.com/office/drawing/2017/model3d" xmlns:o="urn:schemas-microsoft-com:office:office" xmlns:oel="http://schemas.microsoft.com/office/2019/extlst" xmlns:r="http://schemas.openxmlformats.org/officeDocument/2006/relationships" xmlns:m="http://schemas.openxmlformats.org/officeDocument/2006/math" xmlns:v="urn:schemas-microsoft-com:vml" xmlns:wp14="http://schemas.microsoft.com/office/word/2010/wordprocessingDrawing" xmlns:wp="http://schemas.openxmlformats.org/drawingml/2006/wordprocessingDrawing" xmlns:w10="urn:schemas-microsoft-com:office:word" xmlns:w="http://schemas.openxmlformats.org/wordprocessingml/2006/main" xmlns:w14="http://schemas.microsoft.com/office/word/2010/wordml" xmlns:w15="http://schemas.microsoft.com/office/word/2012/wordml" xmlns:w16cex="http://schemas.microsoft.com/office/word/2018/wordml/cex" xmlns:w16cid="http://schemas.microsoft.com/office/word/2016/wordml/cid" xmlns:w16="http://schemas.microsoft.com/office/word/2018/wordml" xmlns:w16du="http://schemas.microsoft.com/office/word/2023/wordml/word16du" xmlns:w16sdtdh="http://schemas.microsoft.com/office/word/2020/wordml/sdtdatahash" xmlns:w16sdtfl="http://schemas.microsoft.com/office/word/2024/wordml/sdtformatlock" xmlns:w16se="http://schemas.microsoft.com/office/word/2015/wordml/symex" xmlns:wpg="http://schemas.microsoft.com/office/word/2010/wordprocessingGroup" xmlns:wpi="http://schemas.microsoft.com/office/word/2010/wordprocessingInk" xmlns:wne="http://schemas.microsoft.com/office/word/2006/wordml" xmlns:wps="http://schemas.microsoft.com/office/word/2010/wordprocessingShape" mc:Ignorable="w14 w15 w16se w16cid w16 w16cex w16sdtdh w16sdtfl w16du wp14">
   <w:sdt>
     <w:sdtPr>
       <w:id w:val="-1675867429"/>
@@ -11310,7 +11315,7 @@
 </file>
 
 <file path=word/header3.xml><?xml version="1.0" encoding="utf-8"?>
-<w:hdr xmlns:wpc="http://schemas.microsoft.com/office/word/2010/wordprocessingCanvas" xmlns:cx="http://schemas.microsoft.com/office/drawing/2014/chartex" xmlns:cx1="http://schemas.microsoft.com/office/drawing/2015/9/8/chartex" xmlns:cx2="http://schemas.microsoft.com/office/drawing/2015/10/21/chartex" xmlns:cx3="http://schemas.microsoft.com/office/drawing/2016/5/9/chartex" xmlns:cx4="http://schemas.microsoft.com/office/drawing/2016/5/10/chartex" xmlns:cx5="http://schemas.microsoft.com/office/drawing/2016/5/11/chartex" xmlns:cx6="http://schemas.microsoft.com/office/drawing/2016/5/12/chartex" xmlns:cx7="http://schemas.microsoft.com/office/drawing/2016/5/13/chartex" xmlns:cx8="http://schemas.microsoft.com/office/drawing/2016/5/14/chartex" xmlns:mc="http://schemas.openxmlformats.org/markup-compatibility/2006" xmlns:aink="http://schemas.microsoft.com/office/drawing/2016/ink" xmlns:am3d="http://schemas.microsoft.com/office/drawing/2017/model3d" xmlns:o="urn:schemas-microsoft-com:office:office" xmlns:oel="http://schemas.microsoft.com/office/2019/extlst" xmlns:r="http://schemas.openxmlformats.org/officeDocument/2006/relationships" xmlns:m="http://schemas.openxmlformats.org/officeDocument/2006/math" xmlns:v="urn:schemas-microsoft-com:vml" xmlns:wp14="http://schemas.microsoft.com/office/word/2010/wordprocessingDrawing" xmlns:wp="http://schemas.openxmlformats.org/drawingml/2006/wordprocessingDrawing" xmlns:w10="urn:schemas-microsoft-com:office:word" xmlns:w="http://schemas.openxmlformats.org/wordprocessingml/2006/main" xmlns:w14="http://schemas.microsoft.com/office/word/2010/wordml" xmlns:w15="http://schemas.microsoft.com/office/word/2012/wordml" xmlns:w16cex="http://schemas.microsoft.com/office/word/2018/wordml/cex" xmlns:w16cid="http://schemas.microsoft.com/office/word/2016/wordml/cid" xmlns:w16="http://schemas.microsoft.com/office/word/2018/wordml" xmlns:w16sdtdh="http://schemas.microsoft.com/office/word/2020/wordml/sdtdatahash" xmlns:w16se="http://schemas.microsoft.com/office/word/2015/wordml/symex" xmlns:wpg="http://schemas.microsoft.com/office/word/2010/wordprocessingGroup" xmlns:wpi="http://schemas.microsoft.com/office/word/2010/wordprocessingInk" xmlns:wne="http://schemas.microsoft.com/office/word/2006/wordml" xmlns:wps="http://schemas.microsoft.com/office/word/2010/wordprocessingShape" mc:Ignorable="w14 w15 w16se w16cid w16 w16cex w16sdtdh wp14">
+<w:hdr xmlns:wpc="http://schemas.microsoft.com/office/word/2010/wordprocessingCanvas" xmlns:cx="http://schemas.microsoft.com/office/drawing/2014/chartex" xmlns:cx1="http://schemas.microsoft.com/office/drawing/2015/9/8/chartex" xmlns:cx2="http://schemas.microsoft.com/office/drawing/2015/10/21/chartex" xmlns:cx3="http://schemas.microsoft.com/office/drawing/2016/5/9/chartex" xmlns:cx4="http://schemas.microsoft.com/office/drawing/2016/5/10/chartex" xmlns:cx5="http://schemas.microsoft.com/office/drawing/2016/5/11/chartex" xmlns:cx6="http://schemas.microsoft.com/office/drawing/2016/5/12/chartex" xmlns:cx7="http://schemas.microsoft.com/office/drawing/2016/5/13/chartex" xmlns:cx8="http://schemas.microsoft.com/office/drawing/2016/5/14/chartex" xmlns:mc="http://schemas.openxmlformats.org/markup-compatibility/2006" xmlns:aink="http://schemas.microsoft.com/office/drawing/2016/ink" xmlns:am3d="http://schemas.microsoft.com/office/drawing/2017/model3d" xmlns:o="urn:schemas-microsoft-com:office:office" xmlns:oel="http://schemas.microsoft.com/office/2019/extlst" xmlns:r="http://schemas.openxmlformats.org/officeDocument/2006/relationships" xmlns:m="http://schemas.openxmlformats.org/officeDocument/2006/math" xmlns:v="urn:schemas-microsoft-com:vml" xmlns:wp14="http://schemas.microsoft.com/office/word/2010/wordprocessingDrawing" xmlns:wp="http://schemas.openxmlformats.org/drawingml/2006/wordprocessingDrawing" xmlns:w10="urn:schemas-microsoft-com:office:word" xmlns:w="http://schemas.openxmlformats.org/wordprocessingml/2006/main" xmlns:w14="http://schemas.microsoft.com/office/word/2010/wordml" xmlns:w15="http://schemas.microsoft.com/office/word/2012/wordml" xmlns:w16cex="http://schemas.microsoft.com/office/word/2018/wordml/cex" xmlns:w16cid="http://schemas.microsoft.com/office/word/2016/wordml/cid" xmlns:w16="http://schemas.microsoft.com/office/word/2018/wordml" xmlns:w16du="http://schemas.microsoft.com/office/word/2023/wordml/word16du" xmlns:w16sdtdh="http://schemas.microsoft.com/office/word/2020/wordml/sdtdatahash" xmlns:w16sdtfl="http://schemas.microsoft.com/office/word/2024/wordml/sdtformatlock" xmlns:w16se="http://schemas.microsoft.com/office/word/2015/wordml/symex" xmlns:wpg="http://schemas.microsoft.com/office/word/2010/wordprocessingGroup" xmlns:wpi="http://schemas.microsoft.com/office/word/2010/wordprocessingInk" xmlns:wne="http://schemas.microsoft.com/office/word/2006/wordml" xmlns:wps="http://schemas.microsoft.com/office/word/2010/wordprocessingShape" mc:Ignorable="w14 w15 w16se w16cid w16 w16cex w16sdtdh w16sdtfl w16du wp14">
   <w:p>
     <w:pPr>
       <w:pStyle w:val="ae"/>
@@ -11320,7 +11325,7 @@
 </file>
 
 <file path=word/numbering.xml><?xml version="1.0" encoding="utf-8"?>
-<w:numbering xmlns:wpc="http://schemas.microsoft.com/office/word/2010/wordprocessingCanvas" xmlns:cx="http://schemas.microsoft.com/office/drawing/2014/chartex" xmlns:cx1="http://schemas.microsoft.com/office/drawing/2015/9/8/chartex" xmlns:cx2="http://schemas.microsoft.com/office/drawing/2015/10/21/chartex" xmlns:cx3="http://schemas.microsoft.com/office/drawing/2016/5/9/chartex" xmlns:cx4="http://schemas.microsoft.com/office/drawing/2016/5/10/chartex" xmlns:cx5="http://schemas.microsoft.com/office/drawing/2016/5/11/chartex" xmlns:cx6="http://schemas.microsoft.com/office/drawing/2016/5/12/chartex" xmlns:cx7="http://schemas.microsoft.com/office/drawing/2016/5/13/chartex" xmlns:cx8="http://schemas.microsoft.com/office/drawing/2016/5/14/chartex" xmlns:mc="http://schemas.openxmlformats.org/markup-compatibility/2006" xmlns:aink="http://schemas.microsoft.com/office/drawing/2016/ink" xmlns:am3d="http://schemas.microsoft.com/office/drawing/2017/model3d" xmlns:o="urn:schemas-microsoft-com:office:office" xmlns:oel="http://schemas.microsoft.com/office/2019/extlst" xmlns:r="http://schemas.openxmlformats.org/officeDocument/2006/relationships" xmlns:m="http://schemas.openxmlformats.org/officeDocument/2006/math" xmlns:v="urn:schemas-microsoft-com:vml" xmlns:wp14="http://schemas.microsoft.com/office/word/2010/wordprocessingDrawing" xmlns:wp="http://schemas.openxmlformats.org/drawingml/2006/wordprocessingDrawing" xmlns:w10="urn:schemas-microsoft-com:office:word" xmlns:w="http://schemas.openxmlformats.org/wordprocessingml/2006/main" xmlns:w14="http://schemas.microsoft.com/office/word/2010/wordml" xmlns:w15="http://schemas.microsoft.com/office/word/2012/wordml" xmlns:w16cex="http://schemas.microsoft.com/office/word/2018/wordml/cex" xmlns:w16cid="http://schemas.microsoft.com/office/word/2016/wordml/cid" xmlns:w16="http://schemas.microsoft.com/office/word/2018/wordml" xmlns:w16sdtdh="http://schemas.microsoft.com/office/word/2020/wordml/sdtdatahash" xmlns:w16se="http://schemas.microsoft.com/office/word/2015/wordml/symex" xmlns:wpg="http://schemas.microsoft.com/office/word/2010/wordprocessingGroup" xmlns:wpi="http://schemas.microsoft.com/office/word/2010/wordprocessingInk" xmlns:wne="http://schemas.microsoft.com/office/word/2006/wordml" xmlns:wps="http://schemas.microsoft.com/office/word/2010/wordprocessingShape" mc:Ignorable="w14 w15 w16se w16cid w16 w16cex w16sdtdh wp14">
+<w:numbering xmlns:wpc="http://schemas.microsoft.com/office/word/2010/wordprocessingCanvas" xmlns:cx="http://schemas.microsoft.com/office/drawing/2014/chartex" xmlns:cx1="http://schemas.microsoft.com/office/drawing/2015/9/8/chartex" xmlns:cx2="http://schemas.microsoft.com/office/drawing/2015/10/21/chartex" xmlns:cx3="http://schemas.microsoft.com/office/drawing/2016/5/9/chartex" xmlns:cx4="http://schemas.microsoft.com/office/drawing/2016/5/10/chartex" xmlns:cx5="http://schemas.microsoft.com/office/drawing/2016/5/11/chartex" xmlns:cx6="http://schemas.microsoft.com/office/drawing/2016/5/12/chartex" xmlns:cx7="http://schemas.microsoft.com/office/drawing/2016/5/13/chartex" xmlns:cx8="http://schemas.microsoft.com/office/drawing/2016/5/14/chartex" xmlns:mc="http://schemas.openxmlformats.org/markup-compatibility/2006" xmlns:aink="http://schemas.microsoft.com/office/drawing/2016/ink" xmlns:am3d="http://schemas.microsoft.com/office/drawing/2017/model3d" xmlns:o="urn:schemas-microsoft-com:office:office" xmlns:oel="http://schemas.microsoft.com/office/2019/extlst" xmlns:r="http://schemas.openxmlformats.org/officeDocument/2006/relationships" xmlns:m="http://schemas.openxmlformats.org/officeDocument/2006/math" xmlns:v="urn:schemas-microsoft-com:vml" xmlns:wp14="http://schemas.microsoft.com/office/word/2010/wordprocessingDrawing" xmlns:wp="http://schemas.openxmlformats.org/drawingml/2006/wordprocessingDrawing" xmlns:w10="urn:schemas-microsoft-com:office:word" xmlns:w="http://schemas.openxmlformats.org/wordprocessingml/2006/main" xmlns:w14="http://schemas.microsoft.com/office/word/2010/wordml" xmlns:w15="http://schemas.microsoft.com/office/word/2012/wordml" xmlns:w16cex="http://schemas.microsoft.com/office/word/2018/wordml/cex" xmlns:w16cid="http://schemas.microsoft.com/office/word/2016/wordml/cid" xmlns:w16="http://schemas.microsoft.com/office/word/2018/wordml" xmlns:w16du="http://schemas.microsoft.com/office/word/2023/wordml/word16du" xmlns:w16sdtdh="http://schemas.microsoft.com/office/word/2020/wordml/sdtdatahash" xmlns:w16sdtfl="http://schemas.microsoft.com/office/word/2024/wordml/sdtformatlock" xmlns:w16se="http://schemas.microsoft.com/office/word/2015/wordml/symex" xmlns:wpg="http://schemas.microsoft.com/office/word/2010/wordprocessingGroup" xmlns:wpi="http://schemas.microsoft.com/office/word/2010/wordprocessingInk" xmlns:wne="http://schemas.microsoft.com/office/word/2006/wordml" xmlns:wps="http://schemas.microsoft.com/office/word/2010/wordprocessingShape" mc:Ignorable="w14 w15 w16se w16cid w16 w16cex w16sdtdh w16sdtfl w16du wp14">
   <w:abstractNum w:abstractNumId="0" w15:restartNumberingAfterBreak="0">
     <w:nsid w:val="07F43E13"/>
     <w:multiLevelType w:val="multilevel"/>
@@ -12242,7 +12247,7 @@
 </file>
 
 <file path=word/people.xml><?xml version="1.0" encoding="utf-8"?>
-<w15:people xmlns:wpc="http://schemas.microsoft.com/office/word/2010/wordprocessingCanvas" xmlns:cx="http://schemas.microsoft.com/office/drawing/2014/chartex" xmlns:cx1="http://schemas.microsoft.com/office/drawing/2015/9/8/chartex" xmlns:cx2="http://schemas.microsoft.com/office/drawing/2015/10/21/chartex" xmlns:cx3="http://schemas.microsoft.com/office/drawing/2016/5/9/chartex" xmlns:cx4="http://schemas.microsoft.com/office/drawing/2016/5/10/chartex" xmlns:cx5="http://schemas.microsoft.com/office/drawing/2016/5/11/chartex" xmlns:cx6="http://schemas.microsoft.com/office/drawing/2016/5/12/chartex" xmlns:cx7="http://schemas.microsoft.com/office/drawing/2016/5/13/chartex" xmlns:cx8="http://schemas.microsoft.com/office/drawing/2016/5/14/chartex" xmlns:mc="http://schemas.openxmlformats.org/markup-compatibility/2006" xmlns:aink="http://schemas.microsoft.com/office/drawing/2016/ink" xmlns:am3d="http://schemas.microsoft.com/office/drawing/2017/model3d" xmlns:o="urn:schemas-microsoft-com:office:office" xmlns:oel="http://schemas.microsoft.com/office/2019/extlst" xmlns:r="http://schemas.openxmlformats.org/officeDocument/2006/relationships" xmlns:m="http://schemas.openxmlformats.org/officeDocument/2006/math" xmlns:v="urn:schemas-microsoft-com:vml" xmlns:wp14="http://schemas.microsoft.com/office/word/2010/wordprocessingDrawing" xmlns:wp="http://schemas.openxmlformats.org/drawingml/2006/wordprocessingDrawing" xmlns:w10="urn:schemas-microsoft-com:office:word" xmlns:w="http://schemas.openxmlformats.org/wordprocessingml/2006/main" xmlns:w14="http://schemas.microsoft.com/office/word/2010/wordml" xmlns:w15="http://schemas.microsoft.com/office/word/2012/wordml" xmlns:w16cex="http://schemas.microsoft.com/office/word/2018/wordml/cex" xmlns:w16cid="http://schemas.microsoft.com/office/word/2016/wordml/cid" xmlns:w16="http://schemas.microsoft.com/office/word/2018/wordml" xmlns:w16sdtdh="http://schemas.microsoft.com/office/word/2020/wordml/sdtdatahash" xmlns:w16se="http://schemas.microsoft.com/office/word/2015/wordml/symex" xmlns:wpg="http://schemas.microsoft.com/office/word/2010/wordprocessingGroup" xmlns:wpi="http://schemas.microsoft.com/office/word/2010/wordprocessingInk" xmlns:wne="http://schemas.microsoft.com/office/word/2006/wordml" xmlns:wps="http://schemas.microsoft.com/office/word/2010/wordprocessingShape" mc:Ignorable="w14 w15 w16se w16cid w16 w16cex w16sdtdh wp14">
+<w15:people xmlns:wpc="http://schemas.microsoft.com/office/word/2010/wordprocessingCanvas" xmlns:cx="http://schemas.microsoft.com/office/drawing/2014/chartex" xmlns:cx1="http://schemas.microsoft.com/office/drawing/2015/9/8/chartex" xmlns:cx2="http://schemas.microsoft.com/office/drawing/2015/10/21/chartex" xmlns:cx3="http://schemas.microsoft.com/office/drawing/2016/5/9/chartex" xmlns:cx4="http://schemas.microsoft.com/office/drawing/2016/5/10/chartex" xmlns:cx5="http://schemas.microsoft.com/office/drawing/2016/5/11/chartex" xmlns:cx6="http://schemas.microsoft.com/office/drawing/2016/5/12/chartex" xmlns:cx7="http://schemas.microsoft.com/office/drawing/2016/5/13/chartex" xmlns:cx8="http://schemas.microsoft.com/office/drawing/2016/5/14/chartex" xmlns:mc="http://schemas.openxmlformats.org/markup-compatibility/2006" xmlns:aink="http://schemas.microsoft.com/office/drawing/2016/ink" xmlns:am3d="http://schemas.microsoft.com/office/drawing/2017/model3d" xmlns:o="urn:schemas-microsoft-com:office:office" xmlns:oel="http://schemas.microsoft.com/office/2019/extlst" xmlns:r="http://schemas.openxmlformats.org/officeDocument/2006/relationships" xmlns:m="http://schemas.openxmlformats.org/officeDocument/2006/math" xmlns:v="urn:schemas-microsoft-com:vml" xmlns:wp14="http://schemas.microsoft.com/office/word/2010/wordprocessingDrawing" xmlns:wp="http://schemas.openxmlformats.org/drawingml/2006/wordprocessingDrawing" xmlns:w10="urn:schemas-microsoft-com:office:word" xmlns:w="http://schemas.openxmlformats.org/wordprocessingml/2006/main" xmlns:w14="http://schemas.microsoft.com/office/word/2010/wordml" xmlns:w15="http://schemas.microsoft.com/office/word/2012/wordml" xmlns:w16cex="http://schemas.microsoft.com/office/word/2018/wordml/cex" xmlns:w16cid="http://schemas.microsoft.com/office/word/2016/wordml/cid" xmlns:w16="http://schemas.microsoft.com/office/word/2018/wordml" xmlns:w16du="http://schemas.microsoft.com/office/word/2023/wordml/word16du" xmlns:w16sdtdh="http://schemas.microsoft.com/office/word/2020/wordml/sdtdatahash" xmlns:w16sdtfl="http://schemas.microsoft.com/office/word/2024/wordml/sdtformatlock" xmlns:w16se="http://schemas.microsoft.com/office/word/2015/wordml/symex" xmlns:wpg="http://schemas.microsoft.com/office/word/2010/wordprocessingGroup" xmlns:wpi="http://schemas.microsoft.com/office/word/2010/wordprocessingInk" xmlns:wne="http://schemas.microsoft.com/office/word/2006/wordml" xmlns:wps="http://schemas.microsoft.com/office/word/2010/wordprocessingShape" mc:Ignorable="w14 w15 w16se w16cid w16 w16cex w16sdtdh w16sdtfl w16du wp14">
   <w15:person w15:author="Пользователь Windows">
     <w15:presenceInfo w15:providerId="None" w15:userId="Пользователь Windows"/>
   </w15:person>
@@ -12250,7 +12255,7 @@
 </file>
 
 <file path=word/styles.xml><?xml version="1.0" encoding="utf-8"?>
-<w:styles xmlns:mc="http://schemas.openxmlformats.org/markup-compatibility/2006" xmlns:r="http://schemas.openxmlformats.org/officeDocument/2006/relationships" xmlns:w="http://schemas.openxmlformats.org/wordprocessingml/2006/main" xmlns:w14="http://schemas.microsoft.com/office/word/2010/wordml" xmlns:w15="http://schemas.microsoft.com/office/word/2012/wordml" xmlns:w16cex="http://schemas.microsoft.com/office/word/2018/wordml/cex" xmlns:w16cid="http://schemas.microsoft.com/office/word/2016/wordml/cid" xmlns:w16="http://schemas.microsoft.com/office/word/2018/wordml" xmlns:w16sdtdh="http://schemas.microsoft.com/office/word/2020/wordml/sdtdatahash" xmlns:w16se="http://schemas.microsoft.com/office/word/2015/wordml/symex" mc:Ignorable="w14 w15 w16se w16cid w16 w16cex w16sdtdh">
+<w:styles xmlns:mc="http://schemas.openxmlformats.org/markup-compatibility/2006" xmlns:r="http://schemas.openxmlformats.org/officeDocument/2006/relationships" xmlns:w="http://schemas.openxmlformats.org/wordprocessingml/2006/main" xmlns:w14="http://schemas.microsoft.com/office/word/2010/wordml" xmlns:w15="http://schemas.microsoft.com/office/word/2012/wordml" xmlns:w16cex="http://schemas.microsoft.com/office/word/2018/wordml/cex" xmlns:w16cid="http://schemas.microsoft.com/office/word/2016/wordml/cid" xmlns:w16="http://schemas.microsoft.com/office/word/2018/wordml" xmlns:w16du="http://schemas.microsoft.com/office/word/2023/wordml/word16du" xmlns:w16sdtdh="http://schemas.microsoft.com/office/word/2020/wordml/sdtdatahash" xmlns:w16sdtfl="http://schemas.microsoft.com/office/word/2024/wordml/sdtformatlock" xmlns:w16se="http://schemas.microsoft.com/office/word/2015/wordml/symex" mc:Ignorable="w14 w15 w16se w16cid w16 w16cex w16sdtdh w16sdtfl w16du">
   <w:docDefaults>
     <w:rPrDefault>
       <w:rPr>

</xml_diff>